<commit_message>
Update October 2026 honors and publication list in homepage and CV
</commit_message>
<xml_diff>
--- a/cv/Pinglu_Zhang_Academic_CV.docx
+++ b/cv/Pinglu_Zhang_Academic_CV.docx
@@ -382,8 +382,10 @@
     <w:p>
       <w:pPr>
         <w:pStyle w:val="1"/>
-      </w:pPr>
-      <w:r>
+        <w:pageBreakBefore/>
+      </w:pPr>
+      <w:r>
+        <w:lastRenderedPageBreak/>
         <w:t>RESEARCH FUNDING AND HONORS</w:t>
       </w:r>
     </w:p>
@@ -433,6 +435,44 @@
           <w:color w:val="203F60"/>
           <w:sz w:val="19"/>
         </w:rPr>
+        <w:t>Oct 2026</w:t>
+      </w:r>
+      <w:r>
+        <w:tab/>
+        <w:t>National Scholarship</w:t>
+      </w:r>
+    </w:p>
+    <w:p>
+      <w:pPr>
+        <w:pStyle w:val="CVDateEntry"/>
+        <w:keepNext w:val="0"/>
+        <w:spacing w:after="60"/>
+      </w:pPr>
+      <w:r>
+        <w:rPr>
+          <w:rFonts w:ascii="Calibri" w:hAnsi="Calibri"/>
+          <w:color w:val="203F60"/>
+          <w:sz w:val="19"/>
+        </w:rPr>
+        <w:t>Oct 2026</w:t>
+      </w:r>
+      <w:r>
+        <w:tab/>
+        <w:t>Outstanding Poster Award, 5th National Joint Meeting of Deans of Institutes for Frontier and Interdisciplinary Research</w:t>
+      </w:r>
+    </w:p>
+    <w:p>
+      <w:pPr>
+        <w:pStyle w:val="CVDateEntry"/>
+        <w:keepNext w:val="0"/>
+        <w:spacing w:after="60"/>
+      </w:pPr>
+      <w:r>
+        <w:rPr>
+          <w:rFonts w:ascii="Calibri" w:hAnsi="Calibri"/>
+          <w:color w:val="203F60"/>
+          <w:sz w:val="19"/>
+        </w:rPr>
         <w:t>2026</w:t>
       </w:r>
       <w:r>
@@ -481,10 +521,9 @@
     <w:p>
       <w:pPr>
         <w:pStyle w:val="CVPageTitle"/>
-        <w:pageBreakBefore/>
-      </w:pPr>
-      <w:r>
-        <w:lastRenderedPageBreak/>
+        <w:spacing w:before="240"/>
+      </w:pPr>
+      <w:r>
         <w:t>Publications</w:t>
       </w:r>
     </w:p>
@@ -643,7 +682,10 @@
       </w:r>
       <w:r>
         <w:tab/>
-        <w:t>PS-Mixer: A Polar-Vector and Strength-Vector Mixer Model for Multimodal Sentiment Analysis</w:t>
+        <w:t xml:space="preserve">PS-Mixer: A Polar-Vector and Strength-Vector Mixer Model for Multimodal Sentiment </w:t>
+      </w:r>
+      <w:r>
+        <w:t>Analysis</w:t>
       </w:r>
     </w:p>
     <w:p>
@@ -779,10 +821,7 @@
       </w:r>
       <w:r>
         <w:tab/>
-        <w:t xml:space="preserve">High-Quality Large-Scale Viral </w:t>
-      </w:r>
-      <w:r>
-        <w:t>Genome Multiple Sequence Alignment with Updated HAlign4</w:t>
+        <w:t>High-Quality Large-Scale Viral Genome Multiple Sequence Alignment with Updated HAlign4</w:t>
       </w:r>
     </w:p>
     <w:p>
@@ -918,7 +957,10 @@
       </w:r>
       <w:r>
         <w:tab/>
-        <w:t>TAXICF: Efficient Index Construction and Accurate Metagenomic Classification with Interleaved Cuckoo Filters</w:t>
+        <w:t xml:space="preserve">TAXICF: Efficient Index Construction and Accurate Metagenomic Classification with </w:t>
+      </w:r>
+      <w:r>
+        <w:t>Interleaved Cuckoo Filters</w:t>
       </w:r>
     </w:p>
     <w:p>
@@ -950,10 +992,7 @@
         <w:t>International Conference on Intelligent Computing (ICIC 2026)</w:t>
       </w:r>
       <w:r>
-        <w:t xml:space="preserve"> · 2027 · LNCS 16671, 349–360.</w:t>
-      </w:r>
-      <w:r>
-        <w:t xml:space="preserve"> Published online 14 July 2026.</w:t>
+        <w:t xml:space="preserve"> · 2027 · LNCS 16671, 349–360. Published online 14 July 2026.</w:t>
       </w:r>
     </w:p>
     <w:p>
@@ -979,11 +1018,12 @@
           <w:color w:val="77828C"/>
           <w:sz w:val="18"/>
         </w:rPr>
+        <w:lastRenderedPageBreak/>
         <w:t>08</w:t>
       </w:r>
       <w:r>
         <w:tab/>
-        <w:t>Fast and memory efficient partial order alignment with minipoa</w:t>
+        <w:t>A unified framework for potency-oriented AMP discovery via multi-modal learning and guided sequence synthesis</w:t>
       </w:r>
     </w:p>
     <w:p>
@@ -991,7 +1031,7 @@
         <w:pStyle w:val="CVPubAuthors"/>
       </w:pPr>
       <w:r>
-        <w:t xml:space="preserve">Haodong Liu, </w:t>
+        <w:t xml:space="preserve">Wenyu Zhang, Yizheng Wang, Yixiao Zhai, </w:t>
       </w:r>
       <w:r>
         <w:rPr>
@@ -1001,6 +1041,68 @@
         <w:t>Pinglu Zhang</w:t>
       </w:r>
       <w:r>
+        <w:t>, Yijie Ding, and Quan Zou</w:t>
+      </w:r>
+    </w:p>
+    <w:p>
+      <w:pPr>
+        <w:pStyle w:val="CVPubMeta"/>
+      </w:pPr>
+      <w:r>
+        <w:rPr>
+          <w:i/>
+        </w:rPr>
+        <w:t>PLOS Computational Biology</w:t>
+      </w:r>
+      <w:r>
+        <w:t xml:space="preserve"> · 2026 · 22(9): e1014771</w:t>
+      </w:r>
+    </w:p>
+    <w:p>
+      <w:pPr>
+        <w:pStyle w:val="CVPubDOI"/>
+      </w:pPr>
+      <w:hyperlink r:id="rId26">
+        <w:r>
+          <w:rPr>
+            <w:color w:val="203F60"/>
+          </w:rPr>
+          <w:t>doi: 10.1371/journal.pcbi.1014771</w:t>
+        </w:r>
+      </w:hyperlink>
+    </w:p>
+    <w:p>
+      <w:pPr>
+        <w:pStyle w:val="CVPubTitle"/>
+      </w:pPr>
+      <w:r>
+        <w:rPr>
+          <w:b w:val="0"/>
+          <w:color w:val="77828C"/>
+          <w:sz w:val="18"/>
+        </w:rPr>
+        <w:t>09</w:t>
+      </w:r>
+      <w:r>
+        <w:tab/>
+        <w:t>Fast and memory efficient partial order alignment with minipoa</w:t>
+      </w:r>
+    </w:p>
+    <w:p>
+      <w:pPr>
+        <w:pStyle w:val="CVPubAuthors"/>
+      </w:pPr>
+      <w:r>
+        <w:t xml:space="preserve">Haodong Liu, </w:t>
+      </w:r>
+      <w:r>
+        <w:rPr>
+          <w:b/>
+          <w:color w:val="20252D"/>
+        </w:rPr>
+        <w:t>Pinglu Zhang</w:t>
+      </w:r>
+      <w:r>
         <w:t>, Yanming Wei, Qinzhong Tian, Yixiao Zhai, Quan Zou, and Mengting Niu</w:t>
       </w:r>
     </w:p>
@@ -1022,7 +1124,7 @@
       <w:pPr>
         <w:pStyle w:val="CVPubDOI"/>
       </w:pPr>
-      <w:hyperlink r:id="rId26">
+      <w:hyperlink r:id="rId27">
         <w:r>
           <w:rPr>
             <w:color w:val="203F60"/>
@@ -1033,16 +1135,6 @@
     </w:p>
     <w:p>
       <w:pPr>
-        <w:pStyle w:val="CVPageTitle"/>
-        <w:pageBreakBefore/>
-      </w:pPr>
-      <w:r>
-        <w:lastRenderedPageBreak/>
-        <w:t>Publications</w:t>
-      </w:r>
-    </w:p>
-    <w:p>
-      <w:pPr>
         <w:pStyle w:val="CVPubTitle"/>
       </w:pPr>
       <w:r>
@@ -1051,7 +1143,7 @@
           <w:color w:val="77828C"/>
           <w:sz w:val="18"/>
         </w:rPr>
-        <w:t>09</w:t>
+        <w:t>10</w:t>
       </w:r>
       <w:r>
         <w:tab/>
@@ -1094,7 +1186,7 @@
       <w:pPr>
         <w:pStyle w:val="CVPubDOI"/>
       </w:pPr>
-      <w:hyperlink r:id="rId27">
+      <w:hyperlink r:id="rId28">
         <w:r>
           <w:rPr>
             <w:color w:val="203F60"/>
@@ -1113,7 +1205,7 @@
           <w:color w:val="77828C"/>
           <w:sz w:val="18"/>
         </w:rPr>
-        <w:t>10</w:t>
+        <w:t>11</w:t>
       </w:r>
       <w:r>
         <w:tab/>
@@ -1156,7 +1248,7 @@
       <w:pPr>
         <w:pStyle w:val="CVPubDOI"/>
       </w:pPr>
-      <w:hyperlink r:id="rId28">
+      <w:hyperlink r:id="rId29">
         <w:r>
           <w:rPr>
             <w:color w:val="203F60"/>
@@ -1175,7 +1267,7 @@
           <w:color w:val="77828C"/>
           <w:sz w:val="18"/>
         </w:rPr>
-        <w:t>11</w:t>
+        <w:t>12</w:t>
       </w:r>
       <w:r>
         <w:tab/>
@@ -1218,7 +1310,7 @@
       <w:pPr>
         <w:pStyle w:val="CVPubDOI"/>
       </w:pPr>
-      <w:hyperlink r:id="rId29">
+      <w:hyperlink r:id="rId30">
         <w:r>
           <w:rPr>
             <w:color w:val="203F60"/>
@@ -1237,7 +1329,7 @@
           <w:color w:val="77828C"/>
           <w:sz w:val="18"/>
         </w:rPr>
-        <w:t>12</w:t>
+        <w:t>13</w:t>
       </w:r>
       <w:r>
         <w:tab/>
@@ -1270,13 +1362,7 @@
         <w:rPr>
           <w:i/>
         </w:rPr>
-        <w:t xml:space="preserve">International Conference on Intelligent Computing </w:t>
-      </w:r>
-      <w:r>
-        <w:rPr>
-          <w:i/>
-        </w:rPr>
-        <w:t>(ICIC 2025)</w:t>
+        <w:t>International Conference on Intelligent Computing (ICIC 2025)</w:t>
       </w:r>
       <w:r>
         <w:t xml:space="preserve"> · 2025 · LNCS 15867, 447–457.</w:t>
@@ -1286,7 +1372,7 @@
       <w:pPr>
         <w:pStyle w:val="CVPubDOI"/>
       </w:pPr>
-      <w:hyperlink r:id="rId30">
+      <w:hyperlink r:id="rId31">
         <w:r>
           <w:rPr>
             <w:color w:val="203F60"/>
@@ -1305,7 +1391,7 @@
           <w:color w:val="77828C"/>
           <w:sz w:val="18"/>
         </w:rPr>
-        <w:t>13</w:t>
+        <w:t>14</w:t>
       </w:r>
       <w:r>
         <w:tab/>
@@ -1366,7 +1452,7 @@
       <w:pPr>
         <w:pStyle w:val="CVPubDOI"/>
       </w:pPr>
-      <w:hyperlink r:id="rId31">
+      <w:hyperlink r:id="rId32">
         <w:r>
           <w:rPr>
             <w:color w:val="203F60"/>
@@ -1385,7 +1471,7 @@
           <w:color w:val="77828C"/>
           <w:sz w:val="18"/>
         </w:rPr>
-        <w:t>14</w:t>
+        <w:t>15</w:t>
       </w:r>
       <w:r>
         <w:tab/>
@@ -1428,7 +1514,7 @@
       <w:pPr>
         <w:pStyle w:val="CVPubDOI"/>
       </w:pPr>
-      <w:hyperlink r:id="rId32">
+      <w:hyperlink r:id="rId33">
         <w:r>
           <w:rPr>
             <w:color w:val="203F60"/>
@@ -1447,7 +1533,7 @@
           <w:color w:val="77828C"/>
           <w:sz w:val="18"/>
         </w:rPr>
-        <w:t>15</w:t>
+        <w:t>16</w:t>
       </w:r>
       <w:r>
         <w:tab/>
@@ -1490,7 +1576,7 @@
       <w:pPr>
         <w:pStyle w:val="CVPubDOI"/>
       </w:pPr>
-      <w:hyperlink r:id="rId33">
+      <w:hyperlink r:id="rId34">
         <w:r>
           <w:rPr>
             <w:color w:val="203F60"/>
@@ -1509,14 +1595,11 @@
           <w:color w:val="77828C"/>
           <w:sz w:val="18"/>
         </w:rPr>
-        <w:t>16</w:t>
+        <w:t>17</w:t>
       </w:r>
       <w:r>
         <w:tab/>
-        <w:t xml:space="preserve">TPMA: A two pointers meta-alignment tool to ensemble different multiple nucleic acid </w:t>
-      </w:r>
-      <w:r>
-        <w:t>sequence alignments</w:t>
+        <w:t>TPMA: A two pointers meta-alignment tool to ensemble different multiple nucleic acid sequence alignments</w:t>
       </w:r>
     </w:p>
     <w:p>
@@ -1555,7 +1638,7 @@
       <w:pPr>
         <w:pStyle w:val="CVPubDOI"/>
       </w:pPr>
-      <w:hyperlink r:id="rId34">
+      <w:hyperlink r:id="rId35">
         <w:r>
           <w:rPr>
             <w:color w:val="203F60"/>
@@ -1565,12 +1648,12 @@
       </w:hyperlink>
     </w:p>
     <w:sectPr>
-      <w:headerReference w:type="even" r:id="rId35"/>
-      <w:headerReference w:type="default" r:id="rId36"/>
-      <w:footerReference w:type="even" r:id="rId37"/>
-      <w:footerReference w:type="default" r:id="rId38"/>
-      <w:headerReference w:type="first" r:id="rId39"/>
-      <w:footerReference w:type="first" r:id="rId40"/>
+      <w:headerReference w:type="even" r:id="rId36"/>
+      <w:headerReference w:type="default" r:id="rId37"/>
+      <w:footerReference w:type="even" r:id="rId38"/>
+      <w:footerReference w:type="default" r:id="rId39"/>
+      <w:headerReference w:type="first" r:id="rId40"/>
+      <w:footerReference w:type="first" r:id="rId41"/>
       <w:pgSz w:w="11906" w:h="16838"/>
       <w:pgMar w:top="1020" w:right="1077" w:bottom="964" w:left="1077" w:header="454" w:footer="454" w:gutter="0"/>
       <w:cols w:space="720"/>
@@ -2023,31 +2106,31 @@
       </w:rPr>
     </w:lvl>
   </w:abstractNum>
-  <w:num w:numId="1" w16cid:durableId="202255213">
+  <w:num w:numId="1" w16cid:durableId="1756433302">
     <w:abstractNumId w:val="8"/>
   </w:num>
-  <w:num w:numId="2" w16cid:durableId="1251699104">
+  <w:num w:numId="2" w16cid:durableId="47190331">
     <w:abstractNumId w:val="6"/>
   </w:num>
-  <w:num w:numId="3" w16cid:durableId="1391536959">
+  <w:num w:numId="3" w16cid:durableId="957376748">
     <w:abstractNumId w:val="5"/>
   </w:num>
-  <w:num w:numId="4" w16cid:durableId="1229880379">
+  <w:num w:numId="4" w16cid:durableId="689601986">
     <w:abstractNumId w:val="4"/>
   </w:num>
-  <w:num w:numId="5" w16cid:durableId="79063599">
+  <w:num w:numId="5" w16cid:durableId="201938552">
     <w:abstractNumId w:val="7"/>
   </w:num>
-  <w:num w:numId="6" w16cid:durableId="1606963645">
+  <w:num w:numId="6" w16cid:durableId="665983758">
     <w:abstractNumId w:val="3"/>
   </w:num>
-  <w:num w:numId="7" w16cid:durableId="1135761360">
+  <w:num w:numId="7" w16cid:durableId="1180583387">
     <w:abstractNumId w:val="2"/>
   </w:num>
-  <w:num w:numId="8" w16cid:durableId="1300064824">
+  <w:num w:numId="8" w16cid:durableId="1743597192">
     <w:abstractNumId w:val="1"/>
   </w:num>
-  <w:num w:numId="9" w16cid:durableId="1090197626">
+  <w:num w:numId="9" w16cid:durableId="1224367794">
     <w:abstractNumId w:val="0"/>
   </w:num>
 </w:numbering>

</xml_diff>

<commit_message>
Group publications by research area and prioritize lead authors and journal tiers
</commit_message>
<xml_diff>
--- a/cv/Pinglu_Zhang_Academic_CV.docx
+++ b/cv/Pinglu_Zhang_Academic_CV.docx
@@ -537,6 +537,14 @@
     </w:p>
     <w:p>
       <w:pPr>
+        <w:pStyle w:val="CVTopic"/>
+      </w:pPr>
+      <w:r>
+        <w:t>Sequence Alignment</w:t>
+      </w:r>
+    </w:p>
+    <w:p>
+      <w:pPr>
         <w:pStyle w:val="CVPubTitle"/>
       </w:pPr>
       <w:r>
@@ -682,28 +690,16 @@
       </w:r>
       <w:r>
         <w:tab/>
-        <w:t xml:space="preserve">PS-Mixer: A Polar-Vector and Strength-Vector Mixer Model for Multimodal Sentiment </w:t>
-      </w:r>
-      <w:r>
-        <w:t>Analysis</w:t>
+        <w:t xml:space="preserve">FMAlign2: a novel fast multiple nucleotide sequence alignment method for </w:t>
+      </w:r>
+      <w:r>
+        <w:t>ultralong datasets</w:t>
       </w:r>
     </w:p>
     <w:p>
       <w:pPr>
         <w:pStyle w:val="CVPubAuthors"/>
       </w:pPr>
-      <w:r>
-        <w:t>Han Lin</w:t>
-      </w:r>
-      <w:r>
-        <w:rPr>
-          <w:vertAlign w:val="superscript"/>
-        </w:rPr>
-        <w:t>†</w:t>
-      </w:r>
-      <w:r>
-        <w:t xml:space="preserve">, </w:t>
-      </w:r>
       <w:r>
         <w:rPr>
           <w:b/>
@@ -712,71 +708,6 @@
         <w:t>Pinglu Zhang</w:t>
       </w:r>
       <w:r>
-        <w:rPr>
-          <w:vertAlign w:val="superscript"/>
-        </w:rPr>
-        <w:t>†</w:t>
-      </w:r>
-      <w:r>
-        <w:t>, Jiading Ling, Zhenguo Yang, Lap Kei Lee, and Wenyin Liu</w:t>
-      </w:r>
-    </w:p>
-    <w:p>
-      <w:pPr>
-        <w:pStyle w:val="CVPubMeta"/>
-      </w:pPr>
-      <w:r>
-        <w:rPr>
-          <w:i/>
-        </w:rPr>
-        <w:t>Information Processing &amp; Management</w:t>
-      </w:r>
-      <w:r>
-        <w:t xml:space="preserve"> · 2023 · 60(2): 103229</w:t>
-      </w:r>
-    </w:p>
-    <w:p>
-      <w:pPr>
-        <w:pStyle w:val="CVPubDOI"/>
-      </w:pPr>
-      <w:hyperlink r:id="rId21">
-        <w:r>
-          <w:rPr>
-            <w:color w:val="203F60"/>
-          </w:rPr>
-          <w:t>doi: 10.1016/j.ipm.2022.103229</w:t>
-        </w:r>
-      </w:hyperlink>
-    </w:p>
-    <w:p>
-      <w:pPr>
-        <w:pStyle w:val="CVPubTitle"/>
-      </w:pPr>
-      <w:r>
-        <w:rPr>
-          <w:b w:val="0"/>
-          <w:color w:val="77828C"/>
-          <w:sz w:val="18"/>
-        </w:rPr>
-        <w:t>04</w:t>
-      </w:r>
-      <w:r>
-        <w:tab/>
-        <w:t>FMAlign2: a novel fast multiple nucleotide sequence alignment method for ultralong datasets</w:t>
-      </w:r>
-    </w:p>
-    <w:p>
-      <w:pPr>
-        <w:pStyle w:val="CVPubAuthors"/>
-      </w:pPr>
-      <w:r>
-        <w:rPr>
-          <w:b/>
-          <w:color w:val="20252D"/>
-        </w:rPr>
-        <w:t>Pinglu Zhang</w:t>
-      </w:r>
-      <w:r>
         <w:t>, Huan Liu, Yanming Wei, Yixiao Zhai, Qinzhong Tian, and Quan Zou</w:t>
       </w:r>
     </w:p>
@@ -798,7 +729,7 @@
       <w:pPr>
         <w:pStyle w:val="CVPubDOI"/>
       </w:pPr>
-      <w:hyperlink r:id="rId22">
+      <w:hyperlink r:id="rId21">
         <w:r>
           <w:rPr>
             <w:color w:val="203F60"/>
@@ -817,7 +748,7 @@
           <w:color w:val="77828C"/>
           <w:sz w:val="18"/>
         </w:rPr>
-        <w:t>05</w:t>
+        <w:t>04</w:t>
       </w:r>
       <w:r>
         <w:tab/>
@@ -857,7 +788,7 @@
       <w:pPr>
         <w:pStyle w:val="CVPubDOI"/>
       </w:pPr>
-      <w:hyperlink r:id="rId23">
+      <w:hyperlink r:id="rId22">
         <w:r>
           <w:rPr>
             <w:color w:val="203F60"/>
@@ -876,7 +807,7 @@
           <w:color w:val="77828C"/>
           <w:sz w:val="18"/>
         </w:rPr>
-        <w:t>06</w:t>
+        <w:t>05</w:t>
       </w:r>
       <w:r>
         <w:tab/>
@@ -934,7 +865,7 @@
       <w:pPr>
         <w:pStyle w:val="CVPubDOI"/>
       </w:pPr>
-      <w:hyperlink r:id="rId24">
+      <w:hyperlink r:id="rId23">
         <w:r>
           <w:rPr>
             <w:color w:val="203F60"/>
@@ -953,14 +884,11 @@
           <w:color w:val="77828C"/>
           <w:sz w:val="18"/>
         </w:rPr>
-        <w:t>07</w:t>
+        <w:t>06</w:t>
       </w:r>
       <w:r>
         <w:tab/>
-        <w:t xml:space="preserve">TAXICF: Efficient Index Construction and Accurate Metagenomic Classification with </w:t>
-      </w:r>
-      <w:r>
-        <w:t>Interleaved Cuckoo Filters</w:t>
+        <w:t>Fast and memory efficient partial order alignment with minipoa</w:t>
       </w:r>
     </w:p>
     <w:p>
@@ -968,7 +896,7 @@
         <w:pStyle w:val="CVPubAuthors"/>
       </w:pPr>
       <w:r>
-        <w:t xml:space="preserve">Qinzhong Tian, </w:t>
+        <w:t xml:space="preserve">Haodong Liu, </w:t>
       </w:r>
       <w:r>
         <w:rPr>
@@ -978,131 +906,6 @@
         <w:t>Pinglu Zhang</w:t>
       </w:r>
       <w:r>
-        <w:t>, and Quan Zou</w:t>
-      </w:r>
-    </w:p>
-    <w:p>
-      <w:pPr>
-        <w:pStyle w:val="CVPubMeta"/>
-      </w:pPr>
-      <w:r>
-        <w:rPr>
-          <w:i/>
-        </w:rPr>
-        <w:t>International Conference on Intelligent Computing (ICIC 2026)</w:t>
-      </w:r>
-      <w:r>
-        <w:t xml:space="preserve"> · 2027 · LNCS 16671, 349–360. Published online 14 July 2026.</w:t>
-      </w:r>
-    </w:p>
-    <w:p>
-      <w:pPr>
-        <w:pStyle w:val="CVPubDOI"/>
-      </w:pPr>
-      <w:hyperlink r:id="rId25">
-        <w:r>
-          <w:rPr>
-            <w:color w:val="203F60"/>
-          </w:rPr>
-          <w:t>doi: 10.1007/978-981-92-3498-1_30</w:t>
-        </w:r>
-      </w:hyperlink>
-    </w:p>
-    <w:p>
-      <w:pPr>
-        <w:pStyle w:val="CVPubTitle"/>
-      </w:pPr>
-      <w:r>
-        <w:rPr>
-          <w:b w:val="0"/>
-          <w:color w:val="77828C"/>
-          <w:sz w:val="18"/>
-        </w:rPr>
-        <w:lastRenderedPageBreak/>
-        <w:t>08</w:t>
-      </w:r>
-      <w:r>
-        <w:tab/>
-        <w:t>A unified framework for potency-oriented AMP discovery via multi-modal learning and guided sequence synthesis</w:t>
-      </w:r>
-    </w:p>
-    <w:p>
-      <w:pPr>
-        <w:pStyle w:val="CVPubAuthors"/>
-      </w:pPr>
-      <w:r>
-        <w:t xml:space="preserve">Wenyu Zhang, Yizheng Wang, Yixiao Zhai, </w:t>
-      </w:r>
-      <w:r>
-        <w:rPr>
-          <w:b/>
-          <w:color w:val="20252D"/>
-        </w:rPr>
-        <w:t>Pinglu Zhang</w:t>
-      </w:r>
-      <w:r>
-        <w:t>, Yijie Ding, and Quan Zou</w:t>
-      </w:r>
-    </w:p>
-    <w:p>
-      <w:pPr>
-        <w:pStyle w:val="CVPubMeta"/>
-      </w:pPr>
-      <w:r>
-        <w:rPr>
-          <w:i/>
-        </w:rPr>
-        <w:t>PLOS Computational Biology</w:t>
-      </w:r>
-      <w:r>
-        <w:t xml:space="preserve"> · 2026 · 22(9): e1014771</w:t>
-      </w:r>
-    </w:p>
-    <w:p>
-      <w:pPr>
-        <w:pStyle w:val="CVPubDOI"/>
-      </w:pPr>
-      <w:hyperlink r:id="rId26">
-        <w:r>
-          <w:rPr>
-            <w:color w:val="203F60"/>
-          </w:rPr>
-          <w:t>doi: 10.1371/journal.pcbi.1014771</w:t>
-        </w:r>
-      </w:hyperlink>
-    </w:p>
-    <w:p>
-      <w:pPr>
-        <w:pStyle w:val="CVPubTitle"/>
-      </w:pPr>
-      <w:r>
-        <w:rPr>
-          <w:b w:val="0"/>
-          <w:color w:val="77828C"/>
-          <w:sz w:val="18"/>
-        </w:rPr>
-        <w:t>09</w:t>
-      </w:r>
-      <w:r>
-        <w:tab/>
-        <w:t>Fast and memory efficient partial order alignment with minipoa</w:t>
-      </w:r>
-    </w:p>
-    <w:p>
-      <w:pPr>
-        <w:pStyle w:val="CVPubAuthors"/>
-      </w:pPr>
-      <w:r>
-        <w:t xml:space="preserve">Haodong Liu, </w:t>
-      </w:r>
-      <w:r>
-        <w:rPr>
-          <w:b/>
-          <w:color w:val="20252D"/>
-        </w:rPr>
-        <w:t>Pinglu Zhang</w:t>
-      </w:r>
-      <w:r>
         <w:t>, Yanming Wei, Qinzhong Tian, Yixiao Zhai, Quan Zou, and Mengting Niu</w:t>
       </w:r>
     </w:p>
@@ -1124,7 +927,7 @@
       <w:pPr>
         <w:pStyle w:val="CVPubDOI"/>
       </w:pPr>
-      <w:hyperlink r:id="rId27">
+      <w:hyperlink r:id="rId24">
         <w:r>
           <w:rPr>
             <w:color w:val="203F60"/>
@@ -1143,7 +946,7 @@
           <w:color w:val="77828C"/>
           <w:sz w:val="18"/>
         </w:rPr>
-        <w:t>10</w:t>
+        <w:t>07</w:t>
       </w:r>
       <w:r>
         <w:tab/>
@@ -1155,7 +958,10 @@
         <w:pStyle w:val="CVPubAuthors"/>
       </w:pPr>
       <w:r>
-        <w:t xml:space="preserve">Yanming Wei, Zhaoyang Huang, </w:t>
+        <w:t xml:space="preserve">Yanming Wei, </w:t>
+      </w:r>
+      <w:r>
+        <w:t xml:space="preserve">Zhaoyang Huang, </w:t>
       </w:r>
       <w:r>
         <w:rPr>
@@ -1186,7 +992,7 @@
       <w:pPr>
         <w:pStyle w:val="CVPubDOI"/>
       </w:pPr>
-      <w:hyperlink r:id="rId28">
+      <w:hyperlink r:id="rId25">
         <w:r>
           <w:rPr>
             <w:color w:val="203F60"/>
@@ -1205,11 +1011,12 @@
           <w:color w:val="77828C"/>
           <w:sz w:val="18"/>
         </w:rPr>
-        <w:t>11</w:t>
+        <w:lastRenderedPageBreak/>
+        <w:t>08</w:t>
       </w:r>
       <w:r>
         <w:tab/>
-        <w:t>MMSpa is a deep learning-based tool that enhances the identification of spatial domains in spatial transcriptomics studies</w:t>
+        <w:t>Application and Comparison of Machine Learning and Database-Based Methods in Taxonomic Classification of High-Throughput Sequencing Data</w:t>
       </w:r>
     </w:p>
     <w:p>
@@ -1217,7 +1024,7 @@
         <w:pStyle w:val="CVPubAuthors"/>
       </w:pPr>
       <w:r>
-        <w:t xml:space="preserve">Yi Liu, Yixiao Zhai, </w:t>
+        <w:t xml:space="preserve">Qinzhong Tian, </w:t>
       </w:r>
       <w:r>
         <w:rPr>
@@ -1227,7 +1034,7 @@
         <w:t>Pinglu Zhang</w:t>
       </w:r>
       <w:r>
-        <w:t>, Quan Zou, and Ximei Luo</w:t>
+        <w:t>, Yixiao Zhai, Yansu Wang, and Quan Zou</w:t>
       </w:r>
     </w:p>
     <w:p>
@@ -1238,10 +1045,196 @@
         <w:rPr>
           <w:i/>
         </w:rPr>
-        <w:t>PLOS Biology</w:t>
-      </w:r>
-      <w:r>
-        <w:t xml:space="preserve"> · 2026 · 24(1): e3003580</w:t>
+        <w:t>Genome Biology and Evolution</w:t>
+      </w:r>
+      <w:r>
+        <w:t xml:space="preserve"> · 2024 · 16(5): evae102</w:t>
+      </w:r>
+    </w:p>
+    <w:p>
+      <w:pPr>
+        <w:pStyle w:val="CVPubDOI"/>
+      </w:pPr>
+      <w:hyperlink r:id="rId26">
+        <w:r>
+          <w:rPr>
+            <w:color w:val="203F60"/>
+          </w:rPr>
+          <w:t>doi: 10.1093/gbe/evae102</w:t>
+        </w:r>
+      </w:hyperlink>
+    </w:p>
+    <w:p>
+      <w:pPr>
+        <w:pStyle w:val="CVPubTitle"/>
+      </w:pPr>
+      <w:r>
+        <w:rPr>
+          <w:b w:val="0"/>
+          <w:color w:val="77828C"/>
+          <w:sz w:val="18"/>
+        </w:rPr>
+        <w:t>09</w:t>
+      </w:r>
+      <w:r>
+        <w:tab/>
+        <w:t>TPMA: A two pointers meta-alignment tool to ensemble different multiple nucleic acid sequence alignments</w:t>
+      </w:r>
+    </w:p>
+    <w:p>
+      <w:pPr>
+        <w:pStyle w:val="CVPubAuthors"/>
+      </w:pPr>
+      <w:r>
+        <w:t xml:space="preserve">Yixiao Zhai, Jiannan Chao, Yizheng Wang, </w:t>
+      </w:r>
+      <w:r>
+        <w:rPr>
+          <w:b/>
+          <w:color w:val="20252D"/>
+        </w:rPr>
+        <w:t>Pinglu Zhang</w:t>
+      </w:r>
+      <w:r>
+        <w:t>, Furong Tang, and Quan Zou</w:t>
+      </w:r>
+    </w:p>
+    <w:p>
+      <w:pPr>
+        <w:pStyle w:val="CVPubMeta"/>
+      </w:pPr>
+      <w:r>
+        <w:rPr>
+          <w:i/>
+        </w:rPr>
+        <w:t>PLOS Computational Biology</w:t>
+      </w:r>
+      <w:r>
+        <w:t xml:space="preserve"> · 2024 · 20(4): e1011988</w:t>
+      </w:r>
+    </w:p>
+    <w:p>
+      <w:pPr>
+        <w:pStyle w:val="CVPubDOI"/>
+      </w:pPr>
+      <w:hyperlink r:id="rId27">
+        <w:r>
+          <w:rPr>
+            <w:color w:val="203F60"/>
+          </w:rPr>
+          <w:t>doi: 10.1371/journal.pcbi.1011988</w:t>
+        </w:r>
+      </w:hyperlink>
+    </w:p>
+    <w:p>
+      <w:pPr>
+        <w:pStyle w:val="CVPubTitle"/>
+      </w:pPr>
+      <w:r>
+        <w:rPr>
+          <w:b w:val="0"/>
+          <w:color w:val="77828C"/>
+          <w:sz w:val="18"/>
+        </w:rPr>
+        <w:t>10</w:t>
+      </w:r>
+      <w:r>
+        <w:tab/>
+        <w:t>ReAlign-P: a vertical iterative realignment method for protein multiple sequence alignment</w:t>
+      </w:r>
+    </w:p>
+    <w:p>
+      <w:pPr>
+        <w:pStyle w:val="CVPubAuthors"/>
+      </w:pPr>
+      <w:r>
+        <w:t xml:space="preserve">Yixiao Zhai, </w:t>
+      </w:r>
+      <w:r>
+        <w:rPr>
+          <w:b/>
+          <w:color w:val="20252D"/>
+        </w:rPr>
+        <w:t>Pinglu Zhang</w:t>
+      </w:r>
+      <w:r>
+        <w:t>, Quan Zou, and Ximei Luo</w:t>
+      </w:r>
+    </w:p>
+    <w:p>
+      <w:pPr>
+        <w:pStyle w:val="CVPubMeta"/>
+      </w:pPr>
+      <w:r>
+        <w:rPr>
+          <w:i/>
+        </w:rPr>
+        <w:t>Bioinformatics</w:t>
+      </w:r>
+      <w:r>
+        <w:t xml:space="preserve"> · 2025 · 41(8): btaf421</w:t>
+      </w:r>
+    </w:p>
+    <w:p>
+      <w:pPr>
+        <w:pStyle w:val="CVPubDOI"/>
+      </w:pPr>
+      <w:hyperlink r:id="rId28">
+        <w:r>
+          <w:rPr>
+            <w:color w:val="203F60"/>
+          </w:rPr>
+          <w:t>doi: 10.1093/bioinformatics/btaf421</w:t>
+        </w:r>
+      </w:hyperlink>
+    </w:p>
+    <w:p>
+      <w:pPr>
+        <w:pStyle w:val="CVPubTitle"/>
+      </w:pPr>
+      <w:r>
+        <w:rPr>
+          <w:b w:val="0"/>
+          <w:color w:val="77828C"/>
+          <w:sz w:val="18"/>
+        </w:rPr>
+        <w:t>11</w:t>
+      </w:r>
+      <w:r>
+        <w:tab/>
+        <w:t>HAlign 4: a new strategy for rapidly aligning millions of sequences</w:t>
+      </w:r>
+    </w:p>
+    <w:p>
+      <w:pPr>
+        <w:pStyle w:val="CVPubAuthors"/>
+      </w:pPr>
+      <w:r>
+        <w:t xml:space="preserve">Tong Zhou, </w:t>
+      </w:r>
+      <w:r>
+        <w:rPr>
+          <w:b/>
+          <w:color w:val="20252D"/>
+        </w:rPr>
+        <w:t>Pinglu Zhang</w:t>
+      </w:r>
+      <w:r>
+        <w:t>, Quan Zou, and Wu Han</w:t>
+      </w:r>
+    </w:p>
+    <w:p>
+      <w:pPr>
+        <w:pStyle w:val="CVPubMeta"/>
+      </w:pPr>
+      <w:r>
+        <w:rPr>
+          <w:i/>
+        </w:rPr>
+        <w:t>Bioinformatics</w:t>
+      </w:r>
+      <w:r>
+        <w:t xml:space="preserve"> · 2024 · 40(12): btae718</w:t>
       </w:r>
     </w:p>
     <w:p>
@@ -1253,7 +1246,7 @@
           <w:rPr>
             <w:color w:val="203F60"/>
           </w:rPr>
-          <w:t>doi: 10.1371/journal.pbio.3003580</w:t>
+          <w:t>doi: 10.1093/bioinformatics/btae718</w:t>
         </w:r>
       </w:hyperlink>
     </w:p>
@@ -1271,7 +1264,7 @@
       </w:r>
       <w:r>
         <w:tab/>
-        <w:t>ReAlign-P: a vertical iterative realignment method for protein multiple sequence alignment</w:t>
+        <w:t>TAXICF: Efficient Index Construction and Accurate Metagenomic Classification with Interleaved Cuckoo Filters</w:t>
       </w:r>
     </w:p>
     <w:p>
@@ -1279,7 +1272,7 @@
         <w:pStyle w:val="CVPubAuthors"/>
       </w:pPr>
       <w:r>
-        <w:t xml:space="preserve">Yixiao Zhai, </w:t>
+        <w:t xml:space="preserve">Qinzhong Tian, </w:t>
       </w:r>
       <w:r>
         <w:rPr>
@@ -1289,7 +1282,7 @@
         <w:t>Pinglu Zhang</w:t>
       </w:r>
       <w:r>
-        <w:t>, Quan Zou, and Ximei Luo</w:t>
+        <w:t>, and Quan Zou</w:t>
       </w:r>
     </w:p>
     <w:p>
@@ -1300,10 +1293,10 @@
         <w:rPr>
           <w:i/>
         </w:rPr>
-        <w:t>Bioinformatics</w:t>
-      </w:r>
-      <w:r>
-        <w:t xml:space="preserve"> · 2025 · 41(8): btaf421</w:t>
+        <w:t>International Conference on Intelligent Computing (ICIC 2026)</w:t>
+      </w:r>
+      <w:r>
+        <w:t xml:space="preserve"> · 2027 · LNCS 16671, 349–360. Published online 14 July 2026.</w:t>
       </w:r>
     </w:p>
     <w:p>
@@ -1315,7 +1308,7 @@
           <w:rPr>
             <w:color w:val="203F60"/>
           </w:rPr>
-          <w:t>doi: 10.1093/bioinformatics/btaf421</w:t>
+          <w:t>doi: 10.1007/978-981-92-3498-1_30</w:t>
         </w:r>
       </w:hyperlink>
     </w:p>
@@ -1383,6 +1376,14 @@
     </w:p>
     <w:p>
       <w:pPr>
+        <w:pStyle w:val="CVTopic"/>
+      </w:pPr>
+      <w:r>
+        <w:t>Other Publications</w:t>
+      </w:r>
+    </w:p>
+    <w:p>
+      <w:pPr>
         <w:pStyle w:val="CVPubTitle"/>
       </w:pPr>
       <w:r>
@@ -1395,7 +1396,7 @@
       </w:r>
       <w:r>
         <w:tab/>
-        <w:t>TCM@MPXV: A Resource for Treating Monkeypox Patients in Traditional Chinese Medicine</w:t>
+        <w:t>PS-Mixer: A Polar-Vector and Strength-Vector Mixer Model for Multimodal Sentiment Analysis</w:t>
       </w:r>
     </w:p>
     <w:p>
@@ -1403,16 +1404,7 @@
         <w:pStyle w:val="CVPubAuthors"/>
       </w:pPr>
       <w:r>
-        <w:t>Xin Zhang</w:t>
-      </w:r>
-      <w:r>
-        <w:rPr>
-          <w:vertAlign w:val="superscript"/>
-        </w:rPr>
-        <w:t>†</w:t>
-      </w:r>
-      <w:r>
-        <w:t>, Feiran Zhou</w:t>
+        <w:t>Han Lin</w:t>
       </w:r>
       <w:r>
         <w:rPr>
@@ -1431,7 +1423,13 @@
         <w:t>Pinglu Zhang</w:t>
       </w:r>
       <w:r>
-        <w:t>, Quan Zou, and Ying Zhang</w:t>
+        <w:rPr>
+          <w:vertAlign w:val="superscript"/>
+        </w:rPr>
+        <w:t>†</w:t>
+      </w:r>
+      <w:r>
+        <w:t>, Jiading Ling, Zhenguo Yang, Lap Kei Lee, and Wenyin Liu</w:t>
       </w:r>
     </w:p>
     <w:p>
@@ -1442,10 +1440,10 @@
         <w:rPr>
           <w:i/>
         </w:rPr>
-        <w:t>Current Bioinformatics</w:t>
-      </w:r>
-      <w:r>
-        <w:t xml:space="preserve"> · 2025 · 20(6): 557–563</w:t>
+        <w:t>Information Processing &amp; Management</w:t>
+      </w:r>
+      <w:r>
+        <w:t xml:space="preserve"> · 2023 · 60(2): 103229</w:t>
       </w:r>
     </w:p>
     <w:p>
@@ -1457,7 +1455,7 @@
           <w:rPr>
             <w:color w:val="203F60"/>
           </w:rPr>
-          <w:t>doi: 10.2174/0115748936299878240723044438</w:t>
+          <w:t>doi: 10.1016/j.ipm.2022.103229</w:t>
         </w:r>
       </w:hyperlink>
     </w:p>
@@ -1475,7 +1473,7 @@
       </w:r>
       <w:r>
         <w:tab/>
-        <w:t>HAlign 4: a new strategy for rapidly aligning millions of sequences</w:t>
+        <w:t>MMSpa is a deep learning-based tool that enhances the identification of spatial domains in spatial transcriptomics studies</w:t>
       </w:r>
     </w:p>
     <w:p>
@@ -1483,7 +1481,7 @@
         <w:pStyle w:val="CVPubAuthors"/>
       </w:pPr>
       <w:r>
-        <w:t xml:space="preserve">Tong Zhou, </w:t>
+        <w:t xml:space="preserve">Yi Liu, Yixiao Zhai, </w:t>
       </w:r>
       <w:r>
         <w:rPr>
@@ -1493,7 +1491,7 @@
         <w:t>Pinglu Zhang</w:t>
       </w:r>
       <w:r>
-        <w:t>, Quan Zou, and Wu Han</w:t>
+        <w:t>, Quan Zou, and Ximei Luo</w:t>
       </w:r>
     </w:p>
     <w:p>
@@ -1504,10 +1502,10 @@
         <w:rPr>
           <w:i/>
         </w:rPr>
-        <w:t>Bioinformatics</w:t>
-      </w:r>
-      <w:r>
-        <w:t xml:space="preserve"> · 2024 · 40(12): btae718</w:t>
+        <w:t>PLOS Biology</w:t>
+      </w:r>
+      <w:r>
+        <w:t xml:space="preserve"> · 2026 · 24(1): e3003580</w:t>
       </w:r>
     </w:p>
     <w:p>
@@ -1519,7 +1517,7 @@
           <w:rPr>
             <w:color w:val="203F60"/>
           </w:rPr>
-          <w:t>doi: 10.1093/bioinformatics/btae718</w:t>
+          <w:t>doi: 10.1371/journal.pbio.3003580</w:t>
         </w:r>
       </w:hyperlink>
     </w:p>
@@ -1537,7 +1535,7 @@
       </w:r>
       <w:r>
         <w:tab/>
-        <w:t>Application and Comparison of Machine Learning and Database-Based Methods in Taxonomic Classification of High-Throughput Sequencing Data</w:t>
+        <w:t>A unified framework for potency-oriented AMP discovery via multi-modal learning and guided sequence synthesis</w:t>
       </w:r>
     </w:p>
     <w:p>
@@ -1545,7 +1543,7 @@
         <w:pStyle w:val="CVPubAuthors"/>
       </w:pPr>
       <w:r>
-        <w:t xml:space="preserve">Qinzhong Tian, </w:t>
+        <w:t xml:space="preserve">Wenyu Zhang, Yizheng Wang, Yixiao Zhai, </w:t>
       </w:r>
       <w:r>
         <w:rPr>
@@ -1555,7 +1553,7 @@
         <w:t>Pinglu Zhang</w:t>
       </w:r>
       <w:r>
-        <w:t>, Yixiao Zhai, Yansu Wang, and Quan Zou</w:t>
+        <w:t>, Yijie Ding, and Quan Zou</w:t>
       </w:r>
     </w:p>
     <w:p>
@@ -1566,10 +1564,10 @@
         <w:rPr>
           <w:i/>
         </w:rPr>
-        <w:t>Genome Biology and Evolution</w:t>
-      </w:r>
-      <w:r>
-        <w:t xml:space="preserve"> · 2024 · 16(5): evae102</w:t>
+        <w:t>PLOS Computational Biology</w:t>
+      </w:r>
+      <w:r>
+        <w:t xml:space="preserve"> · 2026 · 22(9): e1014771</w:t>
       </w:r>
     </w:p>
     <w:p>
@@ -1581,7 +1579,7 @@
           <w:rPr>
             <w:color w:val="203F60"/>
           </w:rPr>
-          <w:t>doi: 10.1093/gbe/evae102</w:t>
+          <w:t>doi: 10.1371/journal.pcbi.1014771</w:t>
         </w:r>
       </w:hyperlink>
     </w:p>
@@ -1599,7 +1597,7 @@
       </w:r>
       <w:r>
         <w:tab/>
-        <w:t>TPMA: A two pointers meta-alignment tool to ensemble different multiple nucleic acid sequence alignments</w:t>
+        <w:t>TCM@MPXV: A Resource for Treating Monkeypox Patients in Traditional Chinese Medicine</w:t>
       </w:r>
     </w:p>
     <w:p>
@@ -1607,7 +1605,25 @@
         <w:pStyle w:val="CVPubAuthors"/>
       </w:pPr>
       <w:r>
-        <w:t xml:space="preserve">Yixiao Zhai, Jiannan Chao, Yizheng Wang, </w:t>
+        <w:t>Xin Zhang</w:t>
+      </w:r>
+      <w:r>
+        <w:rPr>
+          <w:vertAlign w:val="superscript"/>
+        </w:rPr>
+        <w:t>†</w:t>
+      </w:r>
+      <w:r>
+        <w:t>, Feiran Zhou</w:t>
+      </w:r>
+      <w:r>
+        <w:rPr>
+          <w:vertAlign w:val="superscript"/>
+        </w:rPr>
+        <w:t>†</w:t>
+      </w:r>
+      <w:r>
+        <w:t xml:space="preserve">, </w:t>
       </w:r>
       <w:r>
         <w:rPr>
@@ -1617,7 +1633,7 @@
         <w:t>Pinglu Zhang</w:t>
       </w:r>
       <w:r>
-        <w:t>, Furong Tang, and Quan Zou</w:t>
+        <w:t>, Quan Zou, and Ying Zhang</w:t>
       </w:r>
     </w:p>
     <w:p>
@@ -1628,10 +1644,10 @@
         <w:rPr>
           <w:i/>
         </w:rPr>
-        <w:t>PLOS Computational Biology</w:t>
-      </w:r>
-      <w:r>
-        <w:t xml:space="preserve"> · 2024 · 20(4): e1011988</w:t>
+        <w:t>Current Bioinformatics</w:t>
+      </w:r>
+      <w:r>
+        <w:t xml:space="preserve"> · 2025 · 20(6): 557–563</w:t>
       </w:r>
     </w:p>
     <w:p>
@@ -1643,7 +1659,7 @@
           <w:rPr>
             <w:color w:val="203F60"/>
           </w:rPr>
-          <w:t>doi: 10.1371/journal.pcbi.1011988</w:t>
+          <w:t>doi: 10.2174/0115748936299878240723044438</w:t>
         </w:r>
       </w:hyperlink>
     </w:p>
@@ -2106,31 +2122,31 @@
       </w:rPr>
     </w:lvl>
   </w:abstractNum>
-  <w:num w:numId="1" w16cid:durableId="1756433302">
+  <w:num w:numId="1" w16cid:durableId="1637754381">
     <w:abstractNumId w:val="8"/>
   </w:num>
-  <w:num w:numId="2" w16cid:durableId="47190331">
+  <w:num w:numId="2" w16cid:durableId="564149364">
     <w:abstractNumId w:val="6"/>
   </w:num>
-  <w:num w:numId="3" w16cid:durableId="957376748">
+  <w:num w:numId="3" w16cid:durableId="1635015148">
     <w:abstractNumId w:val="5"/>
   </w:num>
-  <w:num w:numId="4" w16cid:durableId="689601986">
+  <w:num w:numId="4" w16cid:durableId="727458172">
     <w:abstractNumId w:val="4"/>
   </w:num>
-  <w:num w:numId="5" w16cid:durableId="201938552">
+  <w:num w:numId="5" w16cid:durableId="2028287222">
     <w:abstractNumId w:val="7"/>
   </w:num>
-  <w:num w:numId="6" w16cid:durableId="665983758">
+  <w:num w:numId="6" w16cid:durableId="1005521667">
     <w:abstractNumId w:val="3"/>
   </w:num>
-  <w:num w:numId="7" w16cid:durableId="1180583387">
+  <w:num w:numId="7" w16cid:durableId="1387224209">
     <w:abstractNumId w:val="2"/>
   </w:num>
-  <w:num w:numId="8" w16cid:durableId="1743597192">
+  <w:num w:numId="8" w16cid:durableId="304437501">
     <w:abstractNumId w:val="1"/>
   </w:num>
-  <w:num w:numId="9" w16cid:durableId="1224367794">
+  <w:num w:numId="9" w16cid:durableId="1242523875">
     <w:abstractNumId w:val="0"/>
   </w:num>
 </w:numbering>

</xml_diff>

<commit_message>
Merge publications into one lead-author-first list
</commit_message>
<xml_diff>
--- a/cv/Pinglu_Zhang_Academic_CV.docx
+++ b/cv/Pinglu_Zhang_Academic_CV.docx
@@ -537,14 +537,6 @@
     </w:p>
     <w:p>
       <w:pPr>
-        <w:pStyle w:val="CVTopic"/>
-      </w:pPr>
-      <w:r>
-        <w:t>Sequence Alignment</w:t>
-      </w:r>
-    </w:p>
-    <w:p>
-      <w:pPr>
         <w:pStyle w:val="CVPubTitle"/>
       </w:pPr>
       <w:r>
@@ -690,10 +682,10 @@
       </w:r>
       <w:r>
         <w:tab/>
-        <w:t xml:space="preserve">FMAlign2: a novel fast multiple nucleotide sequence alignment method for </w:t>
-      </w:r>
-      <w:r>
-        <w:t>ultralong datasets</w:t>
+        <w:t xml:space="preserve">FMAlign2: a novel fast multiple nucleotide sequence alignment method for ultralong </w:t>
+      </w:r>
+      <w:r>
+        <w:t>datasets</w:t>
       </w:r>
     </w:p>
     <w:p>
@@ -752,13 +744,25 @@
       </w:r>
       <w:r>
         <w:tab/>
-        <w:t>High-Quality Large-Scale Viral Genome Multiple Sequence Alignment with Updated HAlign4</w:t>
+        <w:t>PS-Mixer: A Polar-Vector and Strength-Vector Mixer Model for Multimodal Sentiment Analysis</w:t>
       </w:r>
     </w:p>
     <w:p>
       <w:pPr>
         <w:pStyle w:val="CVPubAuthors"/>
       </w:pPr>
+      <w:r>
+        <w:t>Han Lin</w:t>
+      </w:r>
+      <w:r>
+        <w:rPr>
+          <w:vertAlign w:val="superscript"/>
+        </w:rPr>
+        <w:t>†</w:t>
+      </w:r>
+      <w:r>
+        <w:t xml:space="preserve">, </w:t>
+      </w:r>
       <w:r>
         <w:rPr>
           <w:b/>
@@ -767,6 +771,71 @@
         <w:t>Pinglu Zhang</w:t>
       </w:r>
       <w:r>
+        <w:rPr>
+          <w:vertAlign w:val="superscript"/>
+        </w:rPr>
+        <w:t>†</w:t>
+      </w:r>
+      <w:r>
+        <w:t>, Jiading Ling, Zhenguo Yang, Lap Kei Lee, and Wenyin Liu</w:t>
+      </w:r>
+    </w:p>
+    <w:p>
+      <w:pPr>
+        <w:pStyle w:val="CVPubMeta"/>
+      </w:pPr>
+      <w:r>
+        <w:rPr>
+          <w:i/>
+        </w:rPr>
+        <w:t>Information Processing &amp; Management</w:t>
+      </w:r>
+      <w:r>
+        <w:t xml:space="preserve"> · 2023 · 60(2): 103229</w:t>
+      </w:r>
+    </w:p>
+    <w:p>
+      <w:pPr>
+        <w:pStyle w:val="CVPubDOI"/>
+      </w:pPr>
+      <w:hyperlink r:id="rId22">
+        <w:r>
+          <w:rPr>
+            <w:color w:val="203F60"/>
+          </w:rPr>
+          <w:t>doi: 10.1016/j.ipm.2022.103229</w:t>
+        </w:r>
+      </w:hyperlink>
+    </w:p>
+    <w:p>
+      <w:pPr>
+        <w:pStyle w:val="CVPubTitle"/>
+      </w:pPr>
+      <w:r>
+        <w:rPr>
+          <w:b w:val="0"/>
+          <w:color w:val="77828C"/>
+          <w:sz w:val="18"/>
+        </w:rPr>
+        <w:t>05</w:t>
+      </w:r>
+      <w:r>
+        <w:tab/>
+        <w:t>High-Quality Large-Scale Viral Genome Multiple Sequence Alignment with Updated HAlign4</w:t>
+      </w:r>
+    </w:p>
+    <w:p>
+      <w:pPr>
+        <w:pStyle w:val="CVPubAuthors"/>
+      </w:pPr>
+      <w:r>
+        <w:rPr>
+          <w:b/>
+          <w:color w:val="20252D"/>
+        </w:rPr>
+        <w:t>Pinglu Zhang</w:t>
+      </w:r>
+      <w:r>
         <w:t>, Qinzhong Tian, Yixiao Zhai, Haodong Liu, and Quan Zou</w:t>
       </w:r>
     </w:p>
@@ -788,7 +857,7 @@
       <w:pPr>
         <w:pStyle w:val="CVPubDOI"/>
       </w:pPr>
-      <w:hyperlink r:id="rId22">
+      <w:hyperlink r:id="rId23">
         <w:r>
           <w:rPr>
             <w:color w:val="203F60"/>
@@ -807,7 +876,7 @@
           <w:color w:val="77828C"/>
           <w:sz w:val="18"/>
         </w:rPr>
-        <w:t>05</w:t>
+        <w:t>06</w:t>
       </w:r>
       <w:r>
         <w:tab/>
@@ -865,7 +934,7 @@
       <w:pPr>
         <w:pStyle w:val="CVPubDOI"/>
       </w:pPr>
-      <w:hyperlink r:id="rId23">
+      <w:hyperlink r:id="rId24">
         <w:r>
           <w:rPr>
             <w:color w:val="203F60"/>
@@ -884,7 +953,7 @@
           <w:color w:val="77828C"/>
           <w:sz w:val="18"/>
         </w:rPr>
-        <w:t>06</w:t>
+        <w:t>07</w:t>
       </w:r>
       <w:r>
         <w:tab/>
@@ -927,7 +996,7 @@
       <w:pPr>
         <w:pStyle w:val="CVPubDOI"/>
       </w:pPr>
-      <w:hyperlink r:id="rId24">
+      <w:hyperlink r:id="rId25">
         <w:r>
           <w:rPr>
             <w:color w:val="203F60"/>
@@ -946,11 +1015,12 @@
           <w:color w:val="77828C"/>
           <w:sz w:val="18"/>
         </w:rPr>
-        <w:t>07</w:t>
+        <w:lastRenderedPageBreak/>
+        <w:t>08</w:t>
       </w:r>
       <w:r>
         <w:tab/>
-        <w:t>deMEM: a novel divide-and-conquer framework based on de Bruijn graph for scalable multiple sequence alignment</w:t>
+        <w:t>MMSpa is a deep learning-based tool that enhances the identification of spatial domains in spatial transcriptomics studies</w:t>
       </w:r>
     </w:p>
     <w:p>
@@ -958,10 +1028,7 @@
         <w:pStyle w:val="CVPubAuthors"/>
       </w:pPr>
       <w:r>
-        <w:t xml:space="preserve">Yanming Wei, </w:t>
-      </w:r>
-      <w:r>
-        <w:t xml:space="preserve">Zhaoyang Huang, </w:t>
+        <w:t xml:space="preserve">Yi Liu, Yixiao Zhai, </w:t>
       </w:r>
       <w:r>
         <w:rPr>
@@ -971,6 +1038,130 @@
         <w:t>Pinglu Zhang</w:t>
       </w:r>
       <w:r>
+        <w:t>, Quan Zou, and Ximei Luo</w:t>
+      </w:r>
+    </w:p>
+    <w:p>
+      <w:pPr>
+        <w:pStyle w:val="CVPubMeta"/>
+      </w:pPr>
+      <w:r>
+        <w:rPr>
+          <w:i/>
+        </w:rPr>
+        <w:t>PLOS Biology</w:t>
+      </w:r>
+      <w:r>
+        <w:t xml:space="preserve"> · 2026 · 24(1): e3003580</w:t>
+      </w:r>
+    </w:p>
+    <w:p>
+      <w:pPr>
+        <w:pStyle w:val="CVPubDOI"/>
+      </w:pPr>
+      <w:hyperlink r:id="rId26">
+        <w:r>
+          <w:rPr>
+            <w:color w:val="203F60"/>
+          </w:rPr>
+          <w:t>doi: 10.1371/journal.pbio.3003580</w:t>
+        </w:r>
+      </w:hyperlink>
+    </w:p>
+    <w:p>
+      <w:pPr>
+        <w:pStyle w:val="CVPubTitle"/>
+      </w:pPr>
+      <w:r>
+        <w:rPr>
+          <w:b w:val="0"/>
+          <w:color w:val="77828C"/>
+          <w:sz w:val="18"/>
+        </w:rPr>
+        <w:t>09</w:t>
+      </w:r>
+      <w:r>
+        <w:tab/>
+        <w:t>A unified framework for potency-oriented AMP discovery via multi-modal learning and guided sequence synthesis</w:t>
+      </w:r>
+    </w:p>
+    <w:p>
+      <w:pPr>
+        <w:pStyle w:val="CVPubAuthors"/>
+      </w:pPr>
+      <w:r>
+        <w:t xml:space="preserve">Wenyu Zhang, Yizheng Wang, Yixiao Zhai, </w:t>
+      </w:r>
+      <w:r>
+        <w:rPr>
+          <w:b/>
+          <w:color w:val="20252D"/>
+        </w:rPr>
+        <w:t>Pinglu Zhang</w:t>
+      </w:r>
+      <w:r>
+        <w:t>, Yijie Ding, and Quan Zou</w:t>
+      </w:r>
+    </w:p>
+    <w:p>
+      <w:pPr>
+        <w:pStyle w:val="CVPubMeta"/>
+      </w:pPr>
+      <w:r>
+        <w:rPr>
+          <w:i/>
+        </w:rPr>
+        <w:t>PLOS Computational Biology</w:t>
+      </w:r>
+      <w:r>
+        <w:t xml:space="preserve"> · 2026 · 22(9): e1014771</w:t>
+      </w:r>
+    </w:p>
+    <w:p>
+      <w:pPr>
+        <w:pStyle w:val="CVPubDOI"/>
+      </w:pPr>
+      <w:hyperlink r:id="rId27">
+        <w:r>
+          <w:rPr>
+            <w:color w:val="203F60"/>
+          </w:rPr>
+          <w:t>doi: 10.1371/journal.pcbi.1014771</w:t>
+        </w:r>
+      </w:hyperlink>
+    </w:p>
+    <w:p>
+      <w:pPr>
+        <w:pStyle w:val="CVPubTitle"/>
+      </w:pPr>
+      <w:r>
+        <w:rPr>
+          <w:b w:val="0"/>
+          <w:color w:val="77828C"/>
+          <w:sz w:val="18"/>
+        </w:rPr>
+        <w:t>10</w:t>
+      </w:r>
+      <w:r>
+        <w:tab/>
+        <w:t>deMEM: a novel divide-and-conquer framework based on de Bruijn graph for scalable multiple sequence alignment</w:t>
+      </w:r>
+    </w:p>
+    <w:p>
+      <w:pPr>
+        <w:pStyle w:val="CVPubAuthors"/>
+      </w:pPr>
+      <w:r>
+        <w:t xml:space="preserve">Yanming Wei, Zhaoyang Huang, </w:t>
+      </w:r>
+      <w:r>
+        <w:rPr>
+          <w:b/>
+          <w:color w:val="20252D"/>
+        </w:rPr>
+        <w:t>Pinglu Zhang</w:t>
+      </w:r>
+      <w:r>
         <w:t>, Yizheng Wang, Yan Li, Liang Yu, and Quan Zou</w:t>
       </w:r>
     </w:p>
@@ -992,7 +1183,7 @@
       <w:pPr>
         <w:pStyle w:val="CVPubDOI"/>
       </w:pPr>
-      <w:hyperlink r:id="rId25">
+      <w:hyperlink r:id="rId28">
         <w:r>
           <w:rPr>
             <w:color w:val="203F60"/>
@@ -1011,8 +1202,7 @@
           <w:color w:val="77828C"/>
           <w:sz w:val="18"/>
         </w:rPr>
-        <w:lastRenderedPageBreak/>
-        <w:t>08</w:t>
+        <w:t>11</w:t>
       </w:r>
       <w:r>
         <w:tab/>
@@ -1034,7 +1224,10 @@
         <w:t>Pinglu Zhang</w:t>
       </w:r>
       <w:r>
-        <w:t>, Yixiao Zhai, Yansu Wang, and Quan Zou</w:t>
+        <w:t>, Yixiao Zhai, Yansu Wang</w:t>
+      </w:r>
+      <w:r>
+        <w:t>, and Quan Zou</w:t>
       </w:r>
     </w:p>
     <w:p>
@@ -1055,7 +1248,7 @@
       <w:pPr>
         <w:pStyle w:val="CVPubDOI"/>
       </w:pPr>
-      <w:hyperlink r:id="rId26">
+      <w:hyperlink r:id="rId29">
         <w:r>
           <w:rPr>
             <w:color w:val="203F60"/>
@@ -1074,7 +1267,7 @@
           <w:color w:val="77828C"/>
           <w:sz w:val="18"/>
         </w:rPr>
-        <w:t>09</w:t>
+        <w:t>12</w:t>
       </w:r>
       <w:r>
         <w:tab/>
@@ -1117,7 +1310,7 @@
       <w:pPr>
         <w:pStyle w:val="CVPubDOI"/>
       </w:pPr>
-      <w:hyperlink r:id="rId27">
+      <w:hyperlink r:id="rId30">
         <w:r>
           <w:rPr>
             <w:color w:val="203F60"/>
@@ -1136,7 +1329,7 @@
           <w:color w:val="77828C"/>
           <w:sz w:val="18"/>
         </w:rPr>
-        <w:t>10</w:t>
+        <w:t>13</w:t>
       </w:r>
       <w:r>
         <w:tab/>
@@ -1179,7 +1372,7 @@
       <w:pPr>
         <w:pStyle w:val="CVPubDOI"/>
       </w:pPr>
-      <w:hyperlink r:id="rId28">
+      <w:hyperlink r:id="rId31">
         <w:r>
           <w:rPr>
             <w:color w:val="203F60"/>
@@ -1198,11 +1391,11 @@
           <w:color w:val="77828C"/>
           <w:sz w:val="18"/>
         </w:rPr>
-        <w:t>11</w:t>
+        <w:t>14</w:t>
       </w:r>
       <w:r>
         <w:tab/>
-        <w:t>HAlign 4: a new strategy for rapidly aligning millions of sequences</w:t>
+        <w:t>TCM@MPXV: A Resource for Treating Monkeypox Patients in Traditional Chinese Medicine</w:t>
       </w:r>
     </w:p>
     <w:p>
@@ -1210,7 +1403,25 @@
         <w:pStyle w:val="CVPubAuthors"/>
       </w:pPr>
       <w:r>
-        <w:t xml:space="preserve">Tong Zhou, </w:t>
+        <w:t>Xin Zhang</w:t>
+      </w:r>
+      <w:r>
+        <w:rPr>
+          <w:vertAlign w:val="superscript"/>
+        </w:rPr>
+        <w:t>†</w:t>
+      </w:r>
+      <w:r>
+        <w:t>, Feiran Zhou</w:t>
+      </w:r>
+      <w:r>
+        <w:rPr>
+          <w:vertAlign w:val="superscript"/>
+        </w:rPr>
+        <w:t>†</w:t>
+      </w:r>
+      <w:r>
+        <w:t xml:space="preserve">, </w:t>
       </w:r>
       <w:r>
         <w:rPr>
@@ -1220,6 +1431,68 @@
         <w:t>Pinglu Zhang</w:t>
       </w:r>
       <w:r>
+        <w:t>, Quan Zou, and Ying Zhang</w:t>
+      </w:r>
+    </w:p>
+    <w:p>
+      <w:pPr>
+        <w:pStyle w:val="CVPubMeta"/>
+      </w:pPr>
+      <w:r>
+        <w:rPr>
+          <w:i/>
+        </w:rPr>
+        <w:t>Current Bioinformatics</w:t>
+      </w:r>
+      <w:r>
+        <w:t xml:space="preserve"> · 2025 · 20(6): 557–563</w:t>
+      </w:r>
+    </w:p>
+    <w:p>
+      <w:pPr>
+        <w:pStyle w:val="CVPubDOI"/>
+      </w:pPr>
+      <w:hyperlink r:id="rId32">
+        <w:r>
+          <w:rPr>
+            <w:color w:val="203F60"/>
+          </w:rPr>
+          <w:t>doi: 10.2174/0115748936299878240723044438</w:t>
+        </w:r>
+      </w:hyperlink>
+    </w:p>
+    <w:p>
+      <w:pPr>
+        <w:pStyle w:val="CVPubTitle"/>
+      </w:pPr>
+      <w:r>
+        <w:rPr>
+          <w:b w:val="0"/>
+          <w:color w:val="77828C"/>
+          <w:sz w:val="18"/>
+        </w:rPr>
+        <w:t>15</w:t>
+      </w:r>
+      <w:r>
+        <w:tab/>
+        <w:t>HAlign 4: a new strategy for rapidly aligning millions of sequences</w:t>
+      </w:r>
+    </w:p>
+    <w:p>
+      <w:pPr>
+        <w:pStyle w:val="CVPubAuthors"/>
+      </w:pPr>
+      <w:r>
+        <w:t xml:space="preserve">Tong Zhou, </w:t>
+      </w:r>
+      <w:r>
+        <w:rPr>
+          <w:b/>
+          <w:color w:val="20252D"/>
+        </w:rPr>
+        <w:t>Pinglu Zhang</w:t>
+      </w:r>
+      <w:r>
         <w:t>, Quan Zou, and Wu Han</w:t>
       </w:r>
     </w:p>
@@ -1241,7 +1514,7 @@
       <w:pPr>
         <w:pStyle w:val="CVPubDOI"/>
       </w:pPr>
-      <w:hyperlink r:id="rId29">
+      <w:hyperlink r:id="rId33">
         <w:r>
           <w:rPr>
             <w:color w:val="203F60"/>
@@ -1260,7 +1533,7 @@
           <w:color w:val="77828C"/>
           <w:sz w:val="18"/>
         </w:rPr>
-        <w:t>12</w:t>
+        <w:t>16</w:t>
       </w:r>
       <w:r>
         <w:tab/>
@@ -1303,7 +1576,7 @@
       <w:pPr>
         <w:pStyle w:val="CVPubDOI"/>
       </w:pPr>
-      <w:hyperlink r:id="rId30">
+      <w:hyperlink r:id="rId34">
         <w:r>
           <w:rPr>
             <w:color w:val="203F60"/>
@@ -1322,7 +1595,7 @@
           <w:color w:val="77828C"/>
           <w:sz w:val="18"/>
         </w:rPr>
-        <w:t>13</w:t>
+        <w:t>17</w:t>
       </w:r>
       <w:r>
         <w:tab/>
@@ -1365,301 +1638,12 @@
       <w:pPr>
         <w:pStyle w:val="CVPubDOI"/>
       </w:pPr>
-      <w:hyperlink r:id="rId31">
+      <w:hyperlink r:id="rId35">
         <w:r>
           <w:rPr>
             <w:color w:val="203F60"/>
           </w:rPr>
           <w:t>doi: 10.1007/978-981-95-0030-7_38</w:t>
-        </w:r>
-      </w:hyperlink>
-    </w:p>
-    <w:p>
-      <w:pPr>
-        <w:pStyle w:val="CVTopic"/>
-      </w:pPr>
-      <w:r>
-        <w:t>Other Publications</w:t>
-      </w:r>
-    </w:p>
-    <w:p>
-      <w:pPr>
-        <w:pStyle w:val="CVPubTitle"/>
-      </w:pPr>
-      <w:r>
-        <w:rPr>
-          <w:b w:val="0"/>
-          <w:color w:val="77828C"/>
-          <w:sz w:val="18"/>
-        </w:rPr>
-        <w:t>14</w:t>
-      </w:r>
-      <w:r>
-        <w:tab/>
-        <w:t>PS-Mixer: A Polar-Vector and Strength-Vector Mixer Model for Multimodal Sentiment Analysis</w:t>
-      </w:r>
-    </w:p>
-    <w:p>
-      <w:pPr>
-        <w:pStyle w:val="CVPubAuthors"/>
-      </w:pPr>
-      <w:r>
-        <w:t>Han Lin</w:t>
-      </w:r>
-      <w:r>
-        <w:rPr>
-          <w:vertAlign w:val="superscript"/>
-        </w:rPr>
-        <w:t>†</w:t>
-      </w:r>
-      <w:r>
-        <w:t xml:space="preserve">, </w:t>
-      </w:r>
-      <w:r>
-        <w:rPr>
-          <w:b/>
-          <w:color w:val="20252D"/>
-        </w:rPr>
-        <w:t>Pinglu Zhang</w:t>
-      </w:r>
-      <w:r>
-        <w:rPr>
-          <w:vertAlign w:val="superscript"/>
-        </w:rPr>
-        <w:t>†</w:t>
-      </w:r>
-      <w:r>
-        <w:t>, Jiading Ling, Zhenguo Yang, Lap Kei Lee, and Wenyin Liu</w:t>
-      </w:r>
-    </w:p>
-    <w:p>
-      <w:pPr>
-        <w:pStyle w:val="CVPubMeta"/>
-      </w:pPr>
-      <w:r>
-        <w:rPr>
-          <w:i/>
-        </w:rPr>
-        <w:t>Information Processing &amp; Management</w:t>
-      </w:r>
-      <w:r>
-        <w:t xml:space="preserve"> · 2023 · 60(2): 103229</w:t>
-      </w:r>
-    </w:p>
-    <w:p>
-      <w:pPr>
-        <w:pStyle w:val="CVPubDOI"/>
-      </w:pPr>
-      <w:hyperlink r:id="rId32">
-        <w:r>
-          <w:rPr>
-            <w:color w:val="203F60"/>
-          </w:rPr>
-          <w:t>doi: 10.1016/j.ipm.2022.103229</w:t>
-        </w:r>
-      </w:hyperlink>
-    </w:p>
-    <w:p>
-      <w:pPr>
-        <w:pStyle w:val="CVPubTitle"/>
-      </w:pPr>
-      <w:r>
-        <w:rPr>
-          <w:b w:val="0"/>
-          <w:color w:val="77828C"/>
-          <w:sz w:val="18"/>
-        </w:rPr>
-        <w:t>15</w:t>
-      </w:r>
-      <w:r>
-        <w:tab/>
-        <w:t>MMSpa is a deep learning-based tool that enhances the identification of spatial domains in spatial transcriptomics studies</w:t>
-      </w:r>
-    </w:p>
-    <w:p>
-      <w:pPr>
-        <w:pStyle w:val="CVPubAuthors"/>
-      </w:pPr>
-      <w:r>
-        <w:t xml:space="preserve">Yi Liu, Yixiao Zhai, </w:t>
-      </w:r>
-      <w:r>
-        <w:rPr>
-          <w:b/>
-          <w:color w:val="20252D"/>
-        </w:rPr>
-        <w:t>Pinglu Zhang</w:t>
-      </w:r>
-      <w:r>
-        <w:t>, Quan Zou, and Ximei Luo</w:t>
-      </w:r>
-    </w:p>
-    <w:p>
-      <w:pPr>
-        <w:pStyle w:val="CVPubMeta"/>
-      </w:pPr>
-      <w:r>
-        <w:rPr>
-          <w:i/>
-        </w:rPr>
-        <w:t>PLOS Biology</w:t>
-      </w:r>
-      <w:r>
-        <w:t xml:space="preserve"> · 2026 · 24(1): e3003580</w:t>
-      </w:r>
-    </w:p>
-    <w:p>
-      <w:pPr>
-        <w:pStyle w:val="CVPubDOI"/>
-      </w:pPr>
-      <w:hyperlink r:id="rId33">
-        <w:r>
-          <w:rPr>
-            <w:color w:val="203F60"/>
-          </w:rPr>
-          <w:t>doi: 10.1371/journal.pbio.3003580</w:t>
-        </w:r>
-      </w:hyperlink>
-    </w:p>
-    <w:p>
-      <w:pPr>
-        <w:pStyle w:val="CVPubTitle"/>
-      </w:pPr>
-      <w:r>
-        <w:rPr>
-          <w:b w:val="0"/>
-          <w:color w:val="77828C"/>
-          <w:sz w:val="18"/>
-        </w:rPr>
-        <w:t>16</w:t>
-      </w:r>
-      <w:r>
-        <w:tab/>
-        <w:t>A unified framework for potency-oriented AMP discovery via multi-modal learning and guided sequence synthesis</w:t>
-      </w:r>
-    </w:p>
-    <w:p>
-      <w:pPr>
-        <w:pStyle w:val="CVPubAuthors"/>
-      </w:pPr>
-      <w:r>
-        <w:t xml:space="preserve">Wenyu Zhang, Yizheng Wang, Yixiao Zhai, </w:t>
-      </w:r>
-      <w:r>
-        <w:rPr>
-          <w:b/>
-          <w:color w:val="20252D"/>
-        </w:rPr>
-        <w:t>Pinglu Zhang</w:t>
-      </w:r>
-      <w:r>
-        <w:t>, Yijie Ding, and Quan Zou</w:t>
-      </w:r>
-    </w:p>
-    <w:p>
-      <w:pPr>
-        <w:pStyle w:val="CVPubMeta"/>
-      </w:pPr>
-      <w:r>
-        <w:rPr>
-          <w:i/>
-        </w:rPr>
-        <w:t>PLOS Computational Biology</w:t>
-      </w:r>
-      <w:r>
-        <w:t xml:space="preserve"> · 2026 · 22(9): e1014771</w:t>
-      </w:r>
-    </w:p>
-    <w:p>
-      <w:pPr>
-        <w:pStyle w:val="CVPubDOI"/>
-      </w:pPr>
-      <w:hyperlink r:id="rId34">
-        <w:r>
-          <w:rPr>
-            <w:color w:val="203F60"/>
-          </w:rPr>
-          <w:t>doi: 10.1371/journal.pcbi.1014771</w:t>
-        </w:r>
-      </w:hyperlink>
-    </w:p>
-    <w:p>
-      <w:pPr>
-        <w:pStyle w:val="CVPubTitle"/>
-      </w:pPr>
-      <w:r>
-        <w:rPr>
-          <w:b w:val="0"/>
-          <w:color w:val="77828C"/>
-          <w:sz w:val="18"/>
-        </w:rPr>
-        <w:t>17</w:t>
-      </w:r>
-      <w:r>
-        <w:tab/>
-        <w:t>TCM@MPXV: A Resource for Treating Monkeypox Patients in Traditional Chinese Medicine</w:t>
-      </w:r>
-    </w:p>
-    <w:p>
-      <w:pPr>
-        <w:pStyle w:val="CVPubAuthors"/>
-      </w:pPr>
-      <w:r>
-        <w:t>Xin Zhang</w:t>
-      </w:r>
-      <w:r>
-        <w:rPr>
-          <w:vertAlign w:val="superscript"/>
-        </w:rPr>
-        <w:t>†</w:t>
-      </w:r>
-      <w:r>
-        <w:t>, Feiran Zhou</w:t>
-      </w:r>
-      <w:r>
-        <w:rPr>
-          <w:vertAlign w:val="superscript"/>
-        </w:rPr>
-        <w:t>†</w:t>
-      </w:r>
-      <w:r>
-        <w:t xml:space="preserve">, </w:t>
-      </w:r>
-      <w:r>
-        <w:rPr>
-          <w:b/>
-          <w:color w:val="20252D"/>
-        </w:rPr>
-        <w:t>Pinglu Zhang</w:t>
-      </w:r>
-      <w:r>
-        <w:t>, Quan Zou, and Ying Zhang</w:t>
-      </w:r>
-    </w:p>
-    <w:p>
-      <w:pPr>
-        <w:pStyle w:val="CVPubMeta"/>
-      </w:pPr>
-      <w:r>
-        <w:rPr>
-          <w:i/>
-        </w:rPr>
-        <w:t>Current Bioinformatics</w:t>
-      </w:r>
-      <w:r>
-        <w:t xml:space="preserve"> · 2025 · 20(6): 557–563</w:t>
-      </w:r>
-    </w:p>
-    <w:p>
-      <w:pPr>
-        <w:pStyle w:val="CVPubDOI"/>
-      </w:pPr>
-      <w:hyperlink r:id="rId35">
-        <w:r>
-          <w:rPr>
-            <w:color w:val="203F60"/>
-          </w:rPr>
-          <w:t>doi: 10.2174/0115748936299878240723044438</w:t>
         </w:r>
       </w:hyperlink>
     </w:p>
@@ -2122,31 +2106,31 @@
       </w:rPr>
     </w:lvl>
   </w:abstractNum>
-  <w:num w:numId="1" w16cid:durableId="1637754381">
+  <w:num w:numId="1" w16cid:durableId="2066829128">
     <w:abstractNumId w:val="8"/>
   </w:num>
-  <w:num w:numId="2" w16cid:durableId="564149364">
+  <w:num w:numId="2" w16cid:durableId="1509323248">
     <w:abstractNumId w:val="6"/>
   </w:num>
-  <w:num w:numId="3" w16cid:durableId="1635015148">
+  <w:num w:numId="3" w16cid:durableId="1267539999">
     <w:abstractNumId w:val="5"/>
   </w:num>
-  <w:num w:numId="4" w16cid:durableId="727458172">
+  <w:num w:numId="4" w16cid:durableId="1294601367">
     <w:abstractNumId w:val="4"/>
   </w:num>
-  <w:num w:numId="5" w16cid:durableId="2028287222">
+  <w:num w:numId="5" w16cid:durableId="74134832">
     <w:abstractNumId w:val="7"/>
   </w:num>
-  <w:num w:numId="6" w16cid:durableId="1005521667">
+  <w:num w:numId="6" w16cid:durableId="1575116451">
     <w:abstractNumId w:val="3"/>
   </w:num>
-  <w:num w:numId="7" w16cid:durableId="1387224209">
+  <w:num w:numId="7" w16cid:durableId="1605960202">
     <w:abstractNumId w:val="2"/>
   </w:num>
-  <w:num w:numId="8" w16cid:durableId="304437501">
+  <w:num w:numId="8" w16cid:durableId="1141995234">
     <w:abstractNumId w:val="1"/>
   </w:num>
-  <w:num w:numId="9" w16cid:durableId="1242523875">
+  <w:num w:numId="9" w16cid:durableId="944188972">
     <w:abstractNumId w:val="0"/>
   </w:num>
 </w:numbering>

</xml_diff>